<commit_message>
Replace Airtable with EU-hosted Baserow for appointment storage
Removes the longest-lived US transfer: DPA annexes, TIA (v0.2), the
company reference file and the frontend agent now point to Baserow
(Netherlands, hosted in Germany).

Co-Authored-By: Claude Opus 5.5 <noreply@anthropic.com>
Claude-Session: https://claude.ai/code/session_013GGgx78UXEJmgiJ5VgvrYf
</commit_message>
<xml_diff>
--- a/contrats/analyse-impact-transferts.docx
+++ b/contrats/analyse-impact-transferts.docx
@@ -20,7 +20,13 @@
           <w:bCs/>
           <w:b/>
         </w:rPr>
-        <w:t xml:space="preserve">PROJET — version 0.1 du 28/10/2026 — NON VALIDÉ JURIDIQUEMENT.</w:t>
+        <w:t xml:space="preserve">PROJET — version 0.2 du 28/10/2026 — NON VALIDÉ JURIDIQUEMENT.</w:t>
+      </w:r>
+      <w:r>
+        <w:t xml:space="preserve"> </w:t>
+      </w:r>
+      <w:r>
+        <w:t xml:space="preserve">v0.2 : Airtable (États-Unis) remplacé par Baserow (UE) — mesure M3 appliquée.</w:t>
       </w:r>
       <w:r>
         <w:t xml:space="preserve"> </w:t>
@@ -579,113 +585,94 @@
               <w:jc w:val="left"/>
             </w:pPr>
             <w:r>
-              <w:t xml:space="preserve">Airtable (Formagrid Inc.)</w:t>
-            </w:r>
-          </w:p>
-        </w:tc>
-        <w:tc>
-          <w:tcPr/>
-          <w:p>
-            <w:pPr>
-              <w:pStyle w:val="Compact"/>
-              <w:jc w:val="left"/>
-            </w:pPr>
-            <w:r>
-              <w:t xml:space="preserve">Stockage des rendez-vous</w:t>
-            </w:r>
-          </w:p>
-        </w:tc>
-        <w:tc>
-          <w:tcPr/>
-          <w:p>
-            <w:pPr>
-              <w:pStyle w:val="Compact"/>
-              <w:jc w:val="left"/>
-            </w:pPr>
-            <w:r>
-              <w:t xml:space="preserve">Nom, téléphone, rendez-vous</w:t>
-            </w:r>
-          </w:p>
-        </w:tc>
-        <w:tc>
-          <w:tcPr/>
-          <w:p>
-            <w:pPr>
-              <w:pStyle w:val="Compact"/>
-              <w:jc w:val="left"/>
-            </w:pPr>
-            <w:r>
-              <w:t xml:space="preserve">Durée du contrat</w:t>
-            </w:r>
-          </w:p>
-        </w:tc>
-        <w:tc>
-          <w:tcPr/>
-          <w:p>
-            <w:pPr>
-              <w:pStyle w:val="Compact"/>
-              <w:jc w:val="left"/>
-            </w:pPr>
+              <w:rPr>
+                <w:strike/>
+              </w:rPr>
+              <w:t xml:space="preserve">Airtable</w:t>
+            </w:r>
+            <w:r>
+              <w:t xml:space="preserve"> </w:t>
+            </w:r>
+            <w:r>
+              <w:t xml:space="preserve">→</w:t>
+            </w:r>
+            <w:r>
+              <w:t xml:space="preserve"> </w:t>
+            </w:r>
             <w:r>
               <w:rPr>
                 <w:bCs/>
                 <w:b/>
               </w:rPr>
-              <w:t xml:space="preserve">Clauses contractuelles types</w:t>
+              <w:t xml:space="preserve">Baserow</w:t>
             </w:r>
             <w:r>
               <w:t xml:space="preserve"> </w:t>
             </w:r>
             <w:r>
-              <w:t xml:space="preserve">(non certifié DPF — VÉRIFIÉ)</w:t>
-            </w:r>
-          </w:p>
-        </w:tc>
-      </w:tr>
-      <w:tr>
-        <w:tc>
-          <w:tcPr/>
-          <w:p>
-            <w:pPr>
-              <w:pStyle w:val="Compact"/>
-              <w:jc w:val="left"/>
-            </w:pPr>
-            <w:r>
-              <w:t xml:space="preserve">ElevenLabs</w:t>
-            </w:r>
-          </w:p>
-        </w:tc>
-        <w:tc>
-          <w:tcPr/>
-          <w:p>
-            <w:pPr>
-              <w:pStyle w:val="Compact"/>
-              <w:jc w:val="left"/>
-            </w:pPr>
-            <w:r>
-              <w:t xml:space="preserve">Synthèse vocale</w:t>
-            </w:r>
-          </w:p>
-        </w:tc>
-        <w:tc>
-          <w:tcPr/>
-          <w:p>
-            <w:pPr>
-              <w:pStyle w:val="Compact"/>
-              <w:jc w:val="left"/>
-            </w:pPr>
-            <w:r>
-              <w:t xml:space="preserve">Texte des réponses de l’assistant (peut contenir prénom, date)</w:t>
-            </w:r>
-          </w:p>
-        </w:tc>
-        <w:tc>
-          <w:tcPr/>
-          <w:p>
-            <w:pPr>
-              <w:pStyle w:val="Compact"/>
-              <w:jc w:val="left"/>
-            </w:pPr>
+              <w:t xml:space="preserve">(Pays-Bas)</w:t>
+            </w:r>
+          </w:p>
+        </w:tc>
+        <w:tc>
+          <w:tcPr/>
+          <w:p>
+            <w:pPr>
+              <w:pStyle w:val="Compact"/>
+              <w:jc w:val="left"/>
+            </w:pPr>
+            <w:r>
+              <w:t xml:space="preserve">Stockage des rendez-vous et transcriptions</w:t>
+            </w:r>
+          </w:p>
+        </w:tc>
+        <w:tc>
+          <w:tcPr/>
+          <w:p>
+            <w:pPr>
+              <w:pStyle w:val="Compact"/>
+              <w:jc w:val="left"/>
+            </w:pPr>
+            <w:r>
+              <w:t xml:space="preserve">Nom, téléphone, rendez-vous, transcriptions</w:t>
+            </w:r>
+          </w:p>
+        </w:tc>
+        <w:tc>
+          <w:tcPr/>
+          <w:p>
+            <w:pPr>
+              <w:pStyle w:val="Compact"/>
+              <w:jc w:val="left"/>
+            </w:pPr>
+            <w:r>
+              <w:t xml:space="preserve">—</w:t>
+            </w:r>
+          </w:p>
+        </w:tc>
+        <w:tc>
+          <w:tcPr/>
+          <w:p>
+            <w:pPr>
+              <w:pStyle w:val="Compact"/>
+              <w:jc w:val="left"/>
+            </w:pPr>
+            <w:r>
+              <w:rPr>
+                <w:bCs/>
+                <w:b/>
+              </w:rPr>
+              <w:t xml:space="preserve">Pas de transfert</w:t>
+            </w:r>
+            <w:r>
+              <w:t xml:space="preserve"> </w:t>
+            </w:r>
+            <w:r>
+              <w:t xml:space="preserve">: hébergement dans l’UE (Allemagne) — VÉRIFIÉ ; hébergeur et sous-traitants de Baserow</w:t>
+            </w:r>
+            <w:r>
+              <w:t xml:space="preserve"> </w:t>
+            </w:r>
             <w:r>
               <w:rPr>
                 <w:bCs/>
@@ -695,6 +682,60 @@
             </w:r>
           </w:p>
         </w:tc>
+      </w:tr>
+      <w:tr>
+        <w:tc>
+          <w:tcPr/>
+          <w:p>
+            <w:pPr>
+              <w:pStyle w:val="Compact"/>
+              <w:jc w:val="left"/>
+            </w:pPr>
+            <w:r>
+              <w:t xml:space="preserve">ElevenLabs</w:t>
+            </w:r>
+          </w:p>
+        </w:tc>
+        <w:tc>
+          <w:tcPr/>
+          <w:p>
+            <w:pPr>
+              <w:pStyle w:val="Compact"/>
+              <w:jc w:val="left"/>
+            </w:pPr>
+            <w:r>
+              <w:t xml:space="preserve">Synthèse vocale</w:t>
+            </w:r>
+          </w:p>
+        </w:tc>
+        <w:tc>
+          <w:tcPr/>
+          <w:p>
+            <w:pPr>
+              <w:pStyle w:val="Compact"/>
+              <w:jc w:val="left"/>
+            </w:pPr>
+            <w:r>
+              <w:t xml:space="preserve">Texte des réponses de l’assistant (peut contenir prénom, date)</w:t>
+            </w:r>
+          </w:p>
+        </w:tc>
+        <w:tc>
+          <w:tcPr/>
+          <w:p>
+            <w:pPr>
+              <w:pStyle w:val="Compact"/>
+              <w:jc w:val="left"/>
+            </w:pPr>
+            <w:r>
+              <w:rPr>
+                <w:bCs/>
+                <w:b/>
+              </w:rPr>
+              <w:t xml:space="preserve">À VÉRIFIER</w:t>
+            </w:r>
+          </w:p>
+        </w:tc>
         <w:tc>
           <w:tcPr/>
           <w:p>
@@ -829,7 +870,7 @@
         <w:t xml:space="preserve"> </w:t>
       </w:r>
       <w:r>
-        <w:t xml:space="preserve">: Vapi, OpenAI, Airtable et le fournisseur de transcription.</w:t>
+        <w:t xml:space="preserve">: Vapi, OpenAI et le fournisseur de transcription.</w:t>
       </w:r>
     </w:p>
     <w:bookmarkEnd w:id="20"/>
@@ -866,7 +907,7 @@
         <w:t xml:space="preserve"> </w:t>
       </w:r>
       <w:r>
-        <w:t xml:space="preserve">contrats de traitement de données (DPA) de Vapi, OpenAI et Airtable.</w:t>
+        <w:t xml:space="preserve">contrats de traitement de données (DPA) de Vapi et d’OpenAI.</w:t>
       </w:r>
       <w:r>
         <w:t xml:space="preserve"> </w:t>
@@ -967,7 +1008,7 @@
         <w:t xml:space="preserve"> </w:t>
       </w:r>
       <w:r>
-        <w:t xml:space="preserve">les fournisseurs de cloud et d’IA comme Vapi, OpenAI et Airtable).</w:t>
+        <w:t xml:space="preserve">les fournisseurs de cloud et d’IA comme Vapi et OpenAI).</w:t>
       </w:r>
       <w:r>
         <w:t xml:space="preserve"> </w:t>
@@ -1593,7 +1634,7 @@
               <w:jc w:val="left"/>
             </w:pPr>
             <w:r>
-              <w:t xml:space="preserve">Réduite pour Vapi (Zero Data Retention) et OpenAI (30 jours, 0 avec ZDR).</w:t>
+              <w:t xml:space="preserve">Réduite pour Vapi (Zero Data Retention) et OpenAI (30 jours, 0 avec ZDR). Le stockage permanent des rendez-vous est désormais</w:t>
             </w:r>
             <w:r>
               <w:t xml:space="preserve"> </w:t>
@@ -1603,13 +1644,13 @@
                 <w:bCs/>
                 <w:b/>
               </w:rPr>
-              <w:t xml:space="preserve">Longue pour Airtable</w:t>
+              <w:t xml:space="preserve">dans l’UE</w:t>
             </w:r>
             <w:r>
               <w:t xml:space="preserve"> </w:t>
             </w:r>
             <w:r>
-              <w:t xml:space="preserve">(stockage permanent des rendez-vous).</w:t>
+              <w:t xml:space="preserve">(Baserow) : il ne fait plus l’objet d’un transfert.</w:t>
             </w:r>
           </w:p>
         </w:tc>
@@ -1645,7 +1686,7 @@
               <w:t xml:space="preserve"> </w:t>
             </w:r>
             <w:r>
-              <w:t xml:space="preserve">: rapports de transparence de Vapi, OpenAI, Airtable et du fournisseur de transcription.</w:t>
+              <w:t xml:space="preserve">: rapports de transparence de Vapi, OpenAI et du fournisseur de transcription.</w:t>
             </w:r>
           </w:p>
         </w:tc>
@@ -2098,13 +2139,10 @@
                 <w:bCs/>
                 <w:b/>
               </w:rPr>
-              <w:t xml:space="preserve">Remplacer Airtable par un stockage situé dans l’UE</w:t>
-            </w:r>
-            <w:r>
-              <w:t xml:space="preserve"> </w:t>
-            </w:r>
-            <w:r>
-              <w:t xml:space="preserve">pour les rendez-vous et transcriptions</w:t>
+              <w:t xml:space="preserve">Remplacer Airtable par Baserow, hébergé dans l’UE</w:t>
+            </w:r>
+            <w:r>
+              <w:t xml:space="preserve">, pour les rendez-vous et transcriptions</w:t>
             </w:r>
           </w:p>
         </w:tc>
@@ -2148,135 +2186,17 @@
                 <w:bCs/>
                 <w:b/>
               </w:rPr>
-              <w:t xml:space="preserve">RECOMMANDÉ</w:t>
+              <w:t xml:space="preserve">DÉCIDÉ le 28/10/2026</w:t>
             </w:r>
             <w:r>
               <w:t xml:space="preserve"> </w:t>
             </w:r>
             <w:r>
-              <w:t xml:space="preserve">— choix du prestataire à faire</w:t>
-            </w:r>
-          </w:p>
-        </w:tc>
-      </w:tr>
-      <w:tr>
-        <w:tc>
-          <w:tcPr/>
-          <w:p>
-            <w:pPr>
-              <w:pStyle w:val="Compact"/>
-              <w:jc w:val="left"/>
-            </w:pPr>
-            <w:r>
-              <w:t xml:space="preserve">M4</w:t>
-            </w:r>
-          </w:p>
-        </w:tc>
-        <w:tc>
-          <w:tcPr/>
-          <w:p>
-            <w:pPr>
-              <w:pStyle w:val="Compact"/>
-              <w:jc w:val="left"/>
-            </w:pPr>
-            <w:r>
-              <w:t xml:space="preserve">Pas d’enregistrement audio</w:t>
-            </w:r>
-          </w:p>
-        </w:tc>
-        <w:tc>
-          <w:tcPr/>
-          <w:p>
-            <w:pPr>
-              <w:pStyle w:val="Compact"/>
-              <w:jc w:val="left"/>
-            </w:pPr>
-            <w:r>
-              <w:t xml:space="preserve">Tous</w:t>
-            </w:r>
-          </w:p>
-        </w:tc>
-        <w:tc>
-          <w:tcPr/>
-          <w:p>
-            <w:pPr>
-              <w:pStyle w:val="Compact"/>
-              <w:jc w:val="left"/>
-            </w:pPr>
-            <w:r>
-              <w:t xml:space="preserve">Moins de données sensibles et identifiantes</w:t>
-            </w:r>
-          </w:p>
-        </w:tc>
-        <w:tc>
-          <w:tcPr/>
-          <w:p>
-            <w:pPr>
-              <w:pStyle w:val="Compact"/>
-              <w:jc w:val="left"/>
-            </w:pPr>
-            <w:r>
-              <w:t xml:space="preserve">Recommandé dans le contrat (art. 2)</w:t>
-            </w:r>
-          </w:p>
-        </w:tc>
-      </w:tr>
-      <w:tr>
-        <w:tc>
-          <w:tcPr/>
-          <w:p>
-            <w:pPr>
-              <w:pStyle w:val="Compact"/>
-              <w:jc w:val="left"/>
-            </w:pPr>
-            <w:r>
-              <w:t xml:space="preserve">M5</w:t>
-            </w:r>
-          </w:p>
-        </w:tc>
-        <w:tc>
-          <w:tcPr/>
-          <w:p>
-            <w:pPr>
-              <w:pStyle w:val="Compact"/>
-              <w:jc w:val="left"/>
-            </w:pPr>
-            <w:r>
-              <w:t xml:space="preserve">Consignes à l’assistant : ne pas demander le motif détaillé ni de données de santé ; ne pas reprendre les révélations spontanées</w:t>
-            </w:r>
-          </w:p>
-        </w:tc>
-        <w:tc>
-          <w:tcPr/>
-          <w:p>
-            <w:pPr>
-              <w:pStyle w:val="Compact"/>
-              <w:jc w:val="left"/>
-            </w:pPr>
-            <w:r>
-              <w:t xml:space="preserve">Tous</w:t>
-            </w:r>
-          </w:p>
-        </w:tc>
-        <w:tc>
-          <w:tcPr/>
-          <w:p>
-            <w:pPr>
-              <w:pStyle w:val="Compact"/>
-              <w:jc w:val="left"/>
-            </w:pPr>
-            <w:r>
-              <w:t xml:space="preserve">Minimisation</w:t>
-            </w:r>
-          </w:p>
-        </w:tc>
-        <w:tc>
-          <w:tcPr/>
-          <w:p>
-            <w:pPr>
-              <w:pStyle w:val="Compact"/>
-              <w:jc w:val="left"/>
-            </w:pPr>
+              <w:t xml:space="preserve">— migration</w:t>
+            </w:r>
+            <w:r>
+              <w:t xml:space="preserve"> </w:t>
+            </w:r>
             <w:r>
               <w:rPr>
                 <w:bCs/>
@@ -2284,6 +2204,134 @@
               </w:rPr>
               <w:t xml:space="preserve">À FAIRE</w:t>
             </w:r>
+          </w:p>
+        </w:tc>
+      </w:tr>
+      <w:tr>
+        <w:tc>
+          <w:tcPr/>
+          <w:p>
+            <w:pPr>
+              <w:pStyle w:val="Compact"/>
+              <w:jc w:val="left"/>
+            </w:pPr>
+            <w:r>
+              <w:t xml:space="preserve">M4</w:t>
+            </w:r>
+          </w:p>
+        </w:tc>
+        <w:tc>
+          <w:tcPr/>
+          <w:p>
+            <w:pPr>
+              <w:pStyle w:val="Compact"/>
+              <w:jc w:val="left"/>
+            </w:pPr>
+            <w:r>
+              <w:t xml:space="preserve">Pas d’enregistrement audio</w:t>
+            </w:r>
+          </w:p>
+        </w:tc>
+        <w:tc>
+          <w:tcPr/>
+          <w:p>
+            <w:pPr>
+              <w:pStyle w:val="Compact"/>
+              <w:jc w:val="left"/>
+            </w:pPr>
+            <w:r>
+              <w:t xml:space="preserve">Tous</w:t>
+            </w:r>
+          </w:p>
+        </w:tc>
+        <w:tc>
+          <w:tcPr/>
+          <w:p>
+            <w:pPr>
+              <w:pStyle w:val="Compact"/>
+              <w:jc w:val="left"/>
+            </w:pPr>
+            <w:r>
+              <w:t xml:space="preserve">Moins de données sensibles et identifiantes</w:t>
+            </w:r>
+          </w:p>
+        </w:tc>
+        <w:tc>
+          <w:tcPr/>
+          <w:p>
+            <w:pPr>
+              <w:pStyle w:val="Compact"/>
+              <w:jc w:val="left"/>
+            </w:pPr>
+            <w:r>
+              <w:t xml:space="preserve">Recommandé dans le contrat (art. 2)</w:t>
+            </w:r>
+          </w:p>
+        </w:tc>
+      </w:tr>
+      <w:tr>
+        <w:tc>
+          <w:tcPr/>
+          <w:p>
+            <w:pPr>
+              <w:pStyle w:val="Compact"/>
+              <w:jc w:val="left"/>
+            </w:pPr>
+            <w:r>
+              <w:t xml:space="preserve">M5</w:t>
+            </w:r>
+          </w:p>
+        </w:tc>
+        <w:tc>
+          <w:tcPr/>
+          <w:p>
+            <w:pPr>
+              <w:pStyle w:val="Compact"/>
+              <w:jc w:val="left"/>
+            </w:pPr>
+            <w:r>
+              <w:t xml:space="preserve">Consignes à l’assistant : ne pas demander le motif détaillé ni de données de santé ; ne pas reprendre les révélations spontanées</w:t>
+            </w:r>
+          </w:p>
+        </w:tc>
+        <w:tc>
+          <w:tcPr/>
+          <w:p>
+            <w:pPr>
+              <w:pStyle w:val="Compact"/>
+              <w:jc w:val="left"/>
+            </w:pPr>
+            <w:r>
+              <w:t xml:space="preserve">Tous</w:t>
+            </w:r>
+          </w:p>
+        </w:tc>
+        <w:tc>
+          <w:tcPr/>
+          <w:p>
+            <w:pPr>
+              <w:pStyle w:val="Compact"/>
+              <w:jc w:val="left"/>
+            </w:pPr>
+            <w:r>
+              <w:t xml:space="preserve">Minimisation</w:t>
+            </w:r>
+          </w:p>
+        </w:tc>
+        <w:tc>
+          <w:tcPr/>
+          <w:p>
+            <w:pPr>
+              <w:pStyle w:val="Compact"/>
+              <w:jc w:val="left"/>
+            </w:pPr>
+            <w:r>
+              <w:rPr>
+                <w:bCs/>
+                <w:b/>
+              </w:rPr>
+              <w:t xml:space="preserve">À FAIRE</w:t>
+            </w:r>
             <w:r>
               <w:t xml:space="preserve"> </w:t>
             </w:r>
@@ -2662,7 +2710,7 @@
         <w:pStyle w:val="Compact"/>
       </w:pPr>
       <w:r>
-        <w:t xml:space="preserve">Accepter et archiver les DPA (avec clauses contractuelles types) de Vapi, OpenAI, Airtable et du</w:t>
+        <w:t xml:space="preserve">Accepter et archiver les DPA (avec clauses contractuelles types) de Vapi, d’OpenAI et du</w:t>
       </w:r>
       <w:r>
         <w:t xml:space="preserve"> </w:t>
@@ -2965,7 +3013,7 @@
                 <w:bCs/>
                 <w:b/>
               </w:rPr>
-              <w:t xml:space="preserve">Airtable</w:t>
+              <w:t xml:space="preserve">Stockage (Baserow)</w:t>
             </w:r>
           </w:p>
         </w:tc>
@@ -2981,29 +3029,13 @@
                 <w:bCs/>
                 <w:b/>
               </w:rPr>
-              <w:t xml:space="preserve">Risque résiduel le plus élevé</w:t>
+              <w:t xml:space="preserve">Plus de transfert</w:t>
             </w:r>
             <w:r>
               <w:t xml:space="preserve"> </w:t>
             </w:r>
             <w:r>
-              <w:t xml:space="preserve">(conservation longue).</w:t>
-            </w:r>
-            <w:r>
-              <w:t xml:space="preserve"> </w:t>
-            </w:r>
-            <w:r>
-              <w:rPr>
-                <w:bCs/>
-                <w:b/>
-              </w:rPr>
-              <w:t xml:space="preserve">Recommandation : remplacer par un stockage dans l’UE (M3).</w:t>
-            </w:r>
-            <w:r>
-              <w:t xml:space="preserve"> </w:t>
-            </w:r>
-            <w:r>
-              <w:t xml:space="preserve">À défaut : acceptable à titre transitoire avec M6 et M8.</w:t>
+              <w:t xml:space="preserve">une fois la migration terminée. Jusque-là, Airtable reste un transfert sous clauses contractuelles types, acceptable à titre transitoire avec M6.</w:t>
             </w:r>
           </w:p>
         </w:tc>
@@ -3086,7 +3118,7 @@
         <w:t xml:space="preserve"> </w:t>
       </w:r>
       <w:r>
-        <w:t xml:space="preserve">fois M1, M3, M4 et M5 en place. Ce risque dépend fortement de l’issue du pourvoi C-703/25 P.</w:t>
+        <w:t xml:space="preserve">fois M1, M3 (migration vers Baserow), M4 et M5 en place. Ce risque dépend fortement de l’issue du pourvoi C-703/25 P.</w:t>
       </w:r>
     </w:p>
     <w:p>

</xml_diff>